<commit_message>
Update Complete Guide to match the verified architecture
Regenerate System_Complete_Guide.docx (and its markdown source) with accurate
solver terminology (eight constraint categories + preferred window, FEASIBLE
status), day-based faculty availability wording, room eligibility (type,
capacity, status, four room types), the three conflict-protection layers,
publish-is-never-automatic workflow, current report endpoint names, and the
faculty-as-records role model.

🤖 Generated with Codebuff
Co-Authored-By: Codebuff <noreply@codebuff.com>
</commit_message>
<xml_diff>
--- a/documentation/System_Complete_Guide.docx
+++ b/documentation/System_Complete_Guide.docx
@@ -12,7 +12,7 @@
     </w:p>
     <w:p>
       <w:r>
-        <w:t>*Updated: September 8, 2026 — reflects the faculty-login removal and print distribution design*</w:t>
+        <w:t>*Updated: September 9, 2026 — synchronized with the verified architecture (commit 7cfe310): accurate solver terminology, three protection layers, room eligibility, and print/PDF distribution*</w:t>
       </w:r>
     </w:p>
     <w:p>
@@ -30,7 +30,7 @@
     </w:p>
     <w:p>
       <w:r>
-        <w:t>An AI-assisted scheduling system for the IT Department that automatically generates conflict-free faculty, classroom, and laboratory schedules using constraint-based optimization (Google OR-Tools CP-SAT).</w:t>
+        <w:t>An AI-assisted, constraint-based scheduling system for the IT Department that generates faculty, classroom, and laboratory schedules using constraint-based optimization (Google OR-Tools CP-SAT).</w:t>
       </w:r>
     </w:p>
     <w:p>
@@ -46,12 +46,14 @@
         </w:rPr>
         <w:t>Admin Login → Manage Scheduling Data → Generate Schedule (AI)</w:t>
         <w:br/>
-        <w:t xml:space="preserve">           → Review/Edit → Approve → Publish → Print/Download for Distribution</w:t>
+        <w:t xml:space="preserve">           → Review/Edit → Approve → Publish Conflict Gate → Publish</w:t>
+        <w:br/>
+        <w:t xml:space="preserve">           → Print/Download → Distribution to Faculty + Students</w:t>
       </w:r>
     </w:p>
     <w:p>
       <w:r>
-        <w:t>Key design decision: Only the Admin/Department Head has a login account. Faculty are records, not users — the system is used per semester by the department, and published schedules are distributed as printed/PDF hard copies.</w:t>
+        <w:t>Key design decision: Only the Admin/Department Head has a login account. Faculty are scheduling records/entities, not system users — the system is operated per semester by the department, and published schedules are distributed as printed/PDF hard copies.</w:t>
       </w:r>
     </w:p>
     <w:p>
@@ -130,7 +132,7 @@
               <w:rPr>
                 <w:sz w:val="20"/>
               </w:rPr>
-              <w:t>Frontend — user interface (port 5173)</w:t>
+              <w:t>Frontend — admin interface (port 5173)</w:t>
             </w:r>
           </w:p>
         </w:tc>
@@ -326,7 +328,7 @@
               <w:rPr>
                 <w:sz w:val="20"/>
               </w:rPr>
-              <w:t>Database</w:t>
+              <w:t>Database — the central persistent store</w:t>
             </w:r>
           </w:p>
         </w:tc>
@@ -351,48 +353,259 @@
           <w:rFonts w:ascii="Consolas" w:hAnsi="Consolas"/>
           <w:sz w:val="18"/>
         </w:rPr>
-        <w:t>┌─────────────────────────────────────────────┐</w:t>
+        <w:t>Admin / Department Head</w:t>
         <w:br/>
-        <w:t>│  FRONTEND (React + TypeScript, port 5173)   │</w:t>
+        <w:t xml:space="preserve">        ↓  (browser)</w:t>
         <w:br/>
-        <w:t>│  Admin Dashboard, CRUD pages, Reports       │</w:t>
+        <w:t>React + TypeScript Frontend (port 5173)</w:t>
         <w:br/>
-        <w:t>└──────────────────┬──────────────────────────┘</w:t>
+        <w:t xml:space="preserve">        ↓  HTTP/JSON + Bearer token</w:t>
         <w:br/>
-        <w:t xml:space="preserve">                   ↓ HTTP/JSON + Bearer token</w:t>
+        <w:t>Laravel Backend API (port 8000)</w:t>
         <w:br/>
-        <w:t>┌─────────────────────────────────────────────┐</w:t>
+        <w:t xml:space="preserve">        ↓                          ↓</w:t>
         <w:br/>
-        <w:t>│  BACKEND (Laravel, port 8000)               │</w:t>
+        <w:t>Eloquent ORM /            HTTP POST /generate-schedule/{id}</w:t>
         <w:br/>
-        <w:t>│  Auth (admin-only), CRUD, approval flow,    │</w:t>
+        <w:t>business workflow                 ↓</w:t>
         <w:br/>
-        <w:t>│  conflict detection, reports                │</w:t>
+        <w:t xml:space="preserve">        ↓                 FastAPI AI Engine (port 8001)</w:t>
         <w:br/>
-        <w:t>└──────────────────┬──────────────────────────┘</w:t>
+        <w:t>PostgreSQL                        ↓</w:t>
         <w:br/>
-        <w:t xml:space="preserve">                   ↓ POST /generate-schedule/{id}</w:t>
+        <w:t xml:space="preserve">        ↕                 OR-Tools CP-SAT Solver</w:t>
         <w:br/>
-        <w:t>┌─────────────────────────────────────────────┐</w:t>
+        <w:t>(reads scheduling data            ↓</w:t>
         <w:br/>
-        <w:t>│  AI ENGINE (FastAPI + CP-SAT, port 8001)    │</w:t>
+        <w:t xml:space="preserve"> via psycopg2)            Candidate Schedule</w:t>
         <w:br/>
-        <w:t>│  Solves the schedule with 8 constraints     │</w:t>
+        <w:t xml:space="preserve">        ↓                         ↓</w:t>
         <w:br/>
-        <w:t>└──────────────────┬──────────────────────────┘</w:t>
-        <w:br/>
-        <w:t xml:space="preserve">                   ↓</w:t>
-        <w:br/>
-        <w:t>┌─────────────────────────────────────────────┐</w:t>
-        <w:br/>
-        <w:t>│  DATABASE (PostgreSQL)                      │</w:t>
-        <w:br/>
-        <w:t>└─────────────────────────────────────────────┘</w:t>
+        <w:t xml:space="preserve">        ←──────── Laravel (stores DRAFT + generation log)</w:t>
       </w:r>
     </w:p>
     <w:p>
       <w:r>
-        <w:t>Why admin-only access? The system is used per semester by the department. Faculty schedules are printed and distributed, so faculty accounts add no value and only widen the security surface. Faculty remain as structured data (name, availability, qualifications, workload, employment type, subject assignments) — exactly what the solver needs.</w:t>
+        <w:t>Communication between components:</w:t>
+      </w:r>
+    </w:p>
+    <w:tbl>
+      <w:tblPr>
+        <w:tblStyle w:val="LightGrid-Accent1"/>
+        <w:tblW w:type="auto" w:w="0"/>
+        <w:tblLook w:firstColumn="1" w:firstRow="1" w:lastColumn="0" w:lastRow="0" w:noHBand="0" w:noVBand="1" w:val="04A0"/>
+      </w:tblPr>
+      <w:tblGrid>
+        <w:gridCol w:w="4320"/>
+        <w:gridCol w:w="4320"/>
+      </w:tblGrid>
+      <w:tr>
+        <w:tc>
+          <w:tcPr>
+            <w:tcW w:type="dxa" w:w="4320"/>
+          </w:tcPr>
+          <w:p>
+            <w:r>
+              <w:rPr>
+                <w:b/>
+                <w:sz w:val="20"/>
+              </w:rPr>
+              <w:t>From → To</w:t>
+            </w:r>
+          </w:p>
+        </w:tc>
+        <w:tc>
+          <w:tcPr>
+            <w:tcW w:type="dxa" w:w="4320"/>
+          </w:tcPr>
+          <w:p>
+            <w:r>
+              <w:rPr>
+                <w:b/>
+                <w:sz w:val="20"/>
+              </w:rPr>
+              <w:t>Mechanism</w:t>
+            </w:r>
+          </w:p>
+        </w:tc>
+      </w:tr>
+      <w:tr>
+        <w:tc>
+          <w:tcPr>
+            <w:tcW w:type="dxa" w:w="4320"/>
+          </w:tcPr>
+          <w:p>
+            <w:r>
+              <w:rPr>
+                <w:sz w:val="20"/>
+              </w:rPr>
+              <w:t>React → Laravel</w:t>
+            </w:r>
+          </w:p>
+        </w:tc>
+        <w:tc>
+          <w:tcPr>
+            <w:tcW w:type="dxa" w:w="4320"/>
+          </w:tcPr>
+          <w:p>
+            <w:r>
+              <w:rPr>
+                <w:sz w:val="20"/>
+              </w:rPr>
+              <w:t>HTTP/JSON requests with a Sanctum Bearer token</w:t>
+            </w:r>
+          </w:p>
+        </w:tc>
+      </w:tr>
+      <w:tr>
+        <w:tc>
+          <w:tcPr>
+            <w:tcW w:type="dxa" w:w="4320"/>
+          </w:tcPr>
+          <w:p>
+            <w:r>
+              <w:rPr>
+                <w:sz w:val="20"/>
+              </w:rPr>
+              <w:t>Laravel → FastAPI</w:t>
+            </w:r>
+          </w:p>
+        </w:tc>
+        <w:tc>
+          <w:tcPr>
+            <w:tcW w:type="dxa" w:w="4320"/>
+          </w:tcPr>
+          <w:p>
+            <w:r>
+              <w:rPr>
+                <w:sz w:val="20"/>
+              </w:rPr>
+              <w:t>HTTP POST generation request per section</w:t>
+            </w:r>
+          </w:p>
+        </w:tc>
+      </w:tr>
+      <w:tr>
+        <w:tc>
+          <w:tcPr>
+            <w:tcW w:type="dxa" w:w="4320"/>
+          </w:tcPr>
+          <w:p>
+            <w:r>
+              <w:rPr>
+                <w:sz w:val="20"/>
+              </w:rPr>
+              <w:t>Laravel → PostgreSQL</w:t>
+            </w:r>
+          </w:p>
+        </w:tc>
+        <w:tc>
+          <w:tcPr>
+            <w:tcW w:type="dxa" w:w="4320"/>
+          </w:tcPr>
+          <w:p>
+            <w:r>
+              <w:rPr>
+                <w:sz w:val="20"/>
+              </w:rPr>
+              <w:t>Eloquent ORM / business workflow operations</w:t>
+            </w:r>
+          </w:p>
+        </w:tc>
+      </w:tr>
+      <w:tr>
+        <w:tc>
+          <w:tcPr>
+            <w:tcW w:type="dxa" w:w="4320"/>
+          </w:tcPr>
+          <w:p>
+            <w:r>
+              <w:rPr>
+                <w:sz w:val="20"/>
+              </w:rPr>
+              <w:t>FastAPI → PostgreSQL</w:t>
+            </w:r>
+          </w:p>
+        </w:tc>
+        <w:tc>
+          <w:tcPr>
+            <w:tcW w:type="dxa" w:w="4320"/>
+          </w:tcPr>
+          <w:p>
+            <w:r>
+              <w:rPr>
+                <w:sz w:val="20"/>
+              </w:rPr>
+              <w:t>Scheduling-data reads through psycopg2</w:t>
+            </w:r>
+          </w:p>
+        </w:tc>
+      </w:tr>
+      <w:tr>
+        <w:tc>
+          <w:tcPr>
+            <w:tcW w:type="dxa" w:w="4320"/>
+          </w:tcPr>
+          <w:p>
+            <w:r>
+              <w:rPr>
+                <w:sz w:val="20"/>
+              </w:rPr>
+              <w:t>FastAPI → CP-SAT</w:t>
+            </w:r>
+          </w:p>
+        </w:tc>
+        <w:tc>
+          <w:tcPr>
+            <w:tcW w:type="dxa" w:w="4320"/>
+          </w:tcPr>
+          <w:p>
+            <w:r>
+              <w:rPr>
+                <w:sz w:val="20"/>
+              </w:rPr>
+              <w:t>Constraint solving</w:t>
+            </w:r>
+          </w:p>
+        </w:tc>
+      </w:tr>
+      <w:tr>
+        <w:tc>
+          <w:tcPr>
+            <w:tcW w:type="dxa" w:w="4320"/>
+          </w:tcPr>
+          <w:p>
+            <w:r>
+              <w:rPr>
+                <w:sz w:val="20"/>
+              </w:rPr>
+              <w:t>Laravel → React</w:t>
+            </w:r>
+          </w:p>
+        </w:tc>
+        <w:tc>
+          <w:tcPr>
+            <w:tcW w:type="dxa" w:w="4320"/>
+          </w:tcPr>
+          <w:p>
+            <w:r>
+              <w:rPr>
+                <w:sz w:val="20"/>
+              </w:rPr>
+              <w:t>JSON responses</w:t>
+            </w:r>
+          </w:p>
+        </w:tc>
+      </w:tr>
+    </w:tbl>
+    <w:p>
+      <w:r>
+        <w:t>Why admin-only access? The department operates the system per semester. Faculty scheduling information is maintained as records by the Admin, and finalized schedules are distributed as printed/PDF copies. Faculty accounts would add maintenance and security overhead with no corresponding benefit. Faculty remain structured data (name, employment type, availability, qualifications, workload, subject assignments) — exactly what the solver needs.</w:t>
+      </w:r>
+    </w:p>
+    <w:p>
+      <w:r>
+        <w:t>Human oversight: the AI produces a *candidate* schedule only. It never publishes. "AI proposes; the Admin decides."</w:t>
       </w:r>
     </w:p>
     <w:p>
@@ -429,6 +642,14 @@
         <w:pStyle w:val="ListNumber"/>
       </w:pPr>
       <w:r>
+        <w:t>React sends an authenticated request; Laravel validates it and controls the workflow</w:t>
+      </w:r>
+    </w:p>
+    <w:p>
+      <w:pPr>
+        <w:pStyle w:val="ListNumber"/>
+      </w:pPr>
+      <w:r>
         <w:t>Laravel archives old drafts for that section</w:t>
       </w:r>
     </w:p>
@@ -437,7 +658,7 @@
         <w:pStyle w:val="ListNumber"/>
       </w:pPr>
       <w:r>
-        <w:t>Laravel calls the FastAI engine (`POST /generate-schedule/{section_id}`)</w:t>
+        <w:t>Laravel calls the FastAPI engine (`POST /generate-schedule/{section_id}`)</w:t>
       </w:r>
     </w:p>
     <w:p>
@@ -445,7 +666,7 @@
         <w:pStyle w:val="ListNumber"/>
       </w:pPr>
       <w:r>
-        <w:t>The engine queries the DB (section, subjects, qualified faculty, rooms, existing committed sessions)</w:t>
+        <w:t>FastAPI reads scheduling data from PostgreSQL: section information, preferred days/time window, assigned subjects, lecture/lab requirements, qualified faculty, faculty availability, teaching loads, available rooms (type, capacity, status), and existing approved/published sessions for cross-section conflict checking</w:t>
       </w:r>
     </w:p>
     <w:p>
@@ -453,7 +674,7 @@
         <w:pStyle w:val="ListNumber"/>
       </w:pPr>
       <w:r>
-        <w:t>CP-SAT solver runs with 8 hard constraints</w:t>
+        <w:t>The CP-SAT solver generates a candidate schedule, maximizing the number of successfully scheduled sessions</w:t>
       </w:r>
     </w:p>
     <w:p>
@@ -461,7 +682,7 @@
         <w:pStyle w:val="ListNumber"/>
       </w:pPr>
       <w:r>
-        <w:t>Returns **OPTIMAL** (all placed), **PARTIAL** (best effort), or **INFEASIBLE**</w:t>
+        <w:t>Returns **OPTIMAL / FEASIBLE / PARTIAL / INFEASIBLE**</w:t>
       </w:r>
     </w:p>
     <w:p>
@@ -469,7 +690,15 @@
         <w:pStyle w:val="ListNumber"/>
       </w:pPr>
       <w:r>
-        <w:t>Laravel persists the schedule as a **draft** and logs the generation</w:t>
+        <w:t>Laravel persists a successful result as a **draft** schedule with its sessions and records the generation log</w:t>
+      </w:r>
+    </w:p>
+    <w:p>
+      <w:pPr>
+        <w:pStyle w:val="ListNumber"/>
+      </w:pPr>
+      <w:r>
+        <w:t>React displays the draft to the Admin</w:t>
       </w:r>
     </w:p>
     <w:p>
@@ -485,7 +714,7 @@
         <w:pStyle w:val="ListNumber"/>
       </w:pPr>
       <w:r>
-        <w:t>Admin **Approves** the draft</w:t>
+        <w:t>Admin **reviews** the draft and may **manually edit** sessions (conflict-checked — see Layer 2 below)</w:t>
       </w:r>
     </w:p>
     <w:p>
@@ -493,7 +722,23 @@
         <w:pStyle w:val="ListNumber"/>
       </w:pPr>
       <w:r>
-        <w:t>Admin **Publishes** — a conflict gate checks cross-section faculty/room double-booking; older published schedules for the same section are auto-archived</w:t>
+        <w:t>Admin **approves** the schedule</w:t>
+      </w:r>
+    </w:p>
+    <w:p>
+      <w:pPr>
+        <w:pStyle w:val="ListNumber"/>
+      </w:pPr>
+      <w:r>
+        <w:t>Admin **publishes** — the publish conflict gate performs a final validation; if conflicts are found, publication is rejected and the schedule stays unpublished until corrected and retried</w:t>
+      </w:r>
+    </w:p>
+    <w:p>
+      <w:pPr>
+        <w:pStyle w:val="ListNumber"/>
+      </w:pPr>
+      <w:r>
+        <w:t>On success, older approved/published schedules for the same section may be archived (current implementation behavior)</w:t>
       </w:r>
     </w:p>
     <w:p>
@@ -502,6 +747,11 @@
       </w:pPr>
       <w:r>
         <w:t>Admin clicks **Print / Download** → print-friendly weekly grid → browser print dialog → **Save as PDF** → hard copies distributed to faculty and students</w:t>
+      </w:r>
+    </w:p>
+    <w:p>
+      <w:r>
+        <w:t>Publishing is NEVER automatic. The Admin/Department Head explicitly approves and publishes.</w:t>
       </w:r>
     </w:p>
     <w:p>
@@ -514,7 +764,7 @@
     </w:p>
     <w:p>
       <w:r>
-        <w:t>Published schedules can be reverted to draft for corrections, then re-approved and re-published.</w:t>
+        <w:t>Published → Unpublish → Draft → Edit → Approve → Publish again. Unpublishing allows corrections while preserving the workflow; it does not restore any earlier database state — it returns the current schedule to draft for editing.</w:t>
       </w:r>
     </w:p>
     <w:p>
@@ -527,7 +777,7 @@
     </w:p>
     <w:p>
       <w:r>
-        <w:t>Draft/approved sessions can be edited (day, time, room, faculty) with real-time conflict detection: room type matching, faculty availability, same-section overlaps, and cross-schedule double-booking.</w:t>
+        <w:t>The Admin can review and manually modify generated sessions (day, time, room, faculty). Each edit is validated server-side against the scheduling rules — room type matching, faculty double-booking, room double-booking, room/lab eligibility, and time-window fit — and rejected with a clear error on conflict. Faculty themselves never edit schedules; they have no system access.</w:t>
       </w:r>
     </w:p>
     <w:p>
@@ -540,7 +790,12 @@
         <w:pStyle w:val="Heading1"/>
       </w:pPr>
       <w:r>
-        <w:t>5. The 8 Hard Constraints (CP-SAT)</w:t>
+        <w:t>5. Scheduling Constraints (CP-SAT)</w:t>
+      </w:r>
+    </w:p>
+    <w:p>
+      <w:r>
+        <w:t>The scheduler models eight main constraint categories, with the section's preferred time window also directly enforced by the solver:</w:t>
       </w:r>
     </w:p>
     <w:tbl>
@@ -606,7 +861,7 @@
               <w:rPr>
                 <w:sz w:val="20"/>
               </w:rPr>
-              <w:t>Faculty qualification — only qualified teachers assigned</w:t>
+              <w:t>Faculty qualification — only qualified teachers assigned (`faculty_subjects`)</w:t>
             </w:r>
           </w:p>
         </w:tc>
@@ -634,7 +889,7 @@
               <w:rPr>
                 <w:sz w:val="20"/>
               </w:rPr>
-              <w:t>Faculty availability — no scheduling outside declared hours</w:t>
+              <w:t>Faculty availability — restricted by each teacher's available **days** (`faculty_availabilities`)</w:t>
             </w:r>
           </w:p>
         </w:tc>
@@ -662,7 +917,7 @@
               <w:rPr>
                 <w:sz w:val="20"/>
               </w:rPr>
-              <w:t>Room type matching — labs in labs, lectures in lecture rooms</w:t>
+              <w:t>Room type matching — labs in the required lab type, lectures in lecture rooms</w:t>
             </w:r>
           </w:p>
         </w:tc>
@@ -690,7 +945,7 @@
               <w:rPr>
                 <w:sz w:val="20"/>
               </w:rPr>
-              <w:t>Room capacity — students ≤ capacity</w:t>
+              <w:t>Room capacity — student count ≤ room capacity</w:t>
             </w:r>
           </w:p>
         </w:tc>
@@ -774,7 +1029,7 @@
               <w:rPr>
                 <w:sz w:val="20"/>
               </w:rPr>
-              <w:t>Max teaching load (default 24h/week)</w:t>
+              <w:t>Maximum teaching load — total scheduled hours per teacher ≤ `max_teaching_load`</w:t>
             </w:r>
           </w:p>
         </w:tc>
@@ -802,7 +1057,7 @@
               <w:rPr>
                 <w:sz w:val="20"/>
               </w:rPr>
-              <w:t>Cross-section conflicts — checked against approved/published schedules</w:t>
+              <w:t>Cross-section conflicts — checked against existing approved/published sessions</w:t>
             </w:r>
           </w:p>
         </w:tc>
@@ -810,7 +1065,33 @@
     </w:tbl>
     <w:p>
       <w:r>
-        <w:t>*Future soft constraints:* mandatory lunch break, senior faculty priority, preference weighting.</w:t>
+        <w:t>Also directly enforced by the solver:</w:t>
+      </w:r>
+    </w:p>
+    <w:p>
+      <w:pPr>
+        <w:pStyle w:val="ListBullet"/>
+      </w:pPr>
+      <w:r>
+        <w:t>**Section preferred scheduling window** — all sessions must fit within the section's preferred days and start/end time; if a subject's required hours cannot fit, the solver reports `INFEASIBLE` with an explanation</w:t>
+      </w:r>
+    </w:p>
+    <w:p>
+      <w:pPr>
+        <w:pStyle w:val="ListBullet"/>
+      </w:pPr>
+      <w:r>
+        <w:t>**Section self-overlap prevention** — a section cannot attend two sessions at once</w:t>
+      </w:r>
+    </w:p>
+    <w:p>
+      <w:r>
+        <w:t>Objective: the solver maximizes the number of successfully scheduled sessions (best-effort scheduling).</w:t>
+      </w:r>
+    </w:p>
+    <w:p>
+      <w:r>
+        <w:t>*Future soft constraints (not implemented):* mandatory lunch break, senior faculty priority, preference weighting.</w:t>
       </w:r>
     </w:p>
     <w:p>
@@ -823,7 +1104,268 @@
         <w:pStyle w:val="Heading1"/>
       </w:pPr>
       <w:r>
-        <w:t>6. Features Reference</w:t>
+        <w:t>6. Solver Result Terminology</w:t>
+      </w:r>
+    </w:p>
+    <w:tbl>
+      <w:tblPr>
+        <w:tblStyle w:val="LightGrid-Accent1"/>
+        <w:tblW w:type="auto" w:w="0"/>
+        <w:tblLook w:firstColumn="1" w:firstRow="1" w:lastColumn="0" w:lastRow="0" w:noHBand="0" w:noVBand="1" w:val="04A0"/>
+      </w:tblPr>
+      <w:tblGrid>
+        <w:gridCol w:w="4320"/>
+        <w:gridCol w:w="4320"/>
+      </w:tblGrid>
+      <w:tr>
+        <w:tc>
+          <w:tcPr>
+            <w:tcW w:type="dxa" w:w="4320"/>
+          </w:tcPr>
+          <w:p>
+            <w:r>
+              <w:rPr>
+                <w:b/>
+                <w:sz w:val="20"/>
+              </w:rPr>
+              <w:t>Status</w:t>
+            </w:r>
+          </w:p>
+        </w:tc>
+        <w:tc>
+          <w:tcPr>
+            <w:tcW w:type="dxa" w:w="4320"/>
+          </w:tcPr>
+          <w:p>
+            <w:r>
+              <w:rPr>
+                <w:b/>
+                <w:sz w:val="20"/>
+              </w:rPr>
+              <w:t>Meaning</w:t>
+            </w:r>
+          </w:p>
+        </w:tc>
+      </w:tr>
+      <w:tr>
+        <w:tc>
+          <w:tcPr>
+            <w:tcW w:type="dxa" w:w="4320"/>
+          </w:tcPr>
+          <w:p>
+            <w:r>
+              <w:rPr>
+                <w:sz w:val="20"/>
+              </w:rPr>
+              <w:t>**OPTIMAL**</w:t>
+            </w:r>
+          </w:p>
+        </w:tc>
+        <w:tc>
+          <w:tcPr>
+            <w:tcW w:type="dxa" w:w="4320"/>
+          </w:tcPr>
+          <w:p>
+            <w:r>
+              <w:rPr>
+                <w:sz w:val="20"/>
+              </w:rPr>
+              <w:t>All required sessions scheduled; the solver proved the objective optimal</w:t>
+            </w:r>
+          </w:p>
+        </w:tc>
+      </w:tr>
+      <w:tr>
+        <w:tc>
+          <w:tcPr>
+            <w:tcW w:type="dxa" w:w="4320"/>
+          </w:tcPr>
+          <w:p>
+            <w:r>
+              <w:rPr>
+                <w:sz w:val="20"/>
+              </w:rPr>
+              <w:t>**FEASIBLE**</w:t>
+            </w:r>
+          </w:p>
+        </w:tc>
+        <w:tc>
+          <w:tcPr>
+            <w:tcW w:type="dxa" w:w="4320"/>
+          </w:tcPr>
+          <w:p>
+            <w:r>
+              <w:rPr>
+                <w:sz w:val="20"/>
+              </w:rPr>
+              <w:t>A feasible solution was found; optimality was not necessarily proven within the solver run</w:t>
+            </w:r>
+          </w:p>
+        </w:tc>
+      </w:tr>
+      <w:tr>
+        <w:tc>
+          <w:tcPr>
+            <w:tcW w:type="dxa" w:w="4320"/>
+          </w:tcPr>
+          <w:p>
+            <w:r>
+              <w:rPr>
+                <w:sz w:val="20"/>
+              </w:rPr>
+              <w:t>**PARTIAL**</w:t>
+            </w:r>
+          </w:p>
+        </w:tc>
+        <w:tc>
+          <w:tcPr>
+            <w:tcW w:type="dxa" w:w="4320"/>
+          </w:tcPr>
+          <w:p>
+            <w:r>
+              <w:rPr>
+                <w:sz w:val="20"/>
+              </w:rPr>
+              <w:t>Some sessions were scheduled; others could not be placed</w:t>
+            </w:r>
+          </w:p>
+        </w:tc>
+      </w:tr>
+      <w:tr>
+        <w:tc>
+          <w:tcPr>
+            <w:tcW w:type="dxa" w:w="4320"/>
+          </w:tcPr>
+          <w:p>
+            <w:r>
+              <w:rPr>
+                <w:sz w:val="20"/>
+              </w:rPr>
+              <w:t>**INFEASIBLE**</w:t>
+            </w:r>
+          </w:p>
+        </w:tc>
+        <w:tc>
+          <w:tcPr>
+            <w:tcW w:type="dxa" w:w="4320"/>
+          </w:tcPr>
+          <w:p>
+            <w:r>
+              <w:rPr>
+                <w:sz w:val="20"/>
+              </w:rPr>
+              <w:t>No sessions could be successfully scheduled under the modeled constraints</w:t>
+            </w:r>
+          </w:p>
+        </w:tc>
+      </w:tr>
+    </w:tbl>
+    <w:p>
+      <w:r>
+        <w:t>Unscheduled sessions include reported reasons such as: no suitable room of the required type, no qualified faculty, insufficient scheduling window, capacity/type constraints, or other modeled conflicts. The system does not guarantee every section produces OPTIMAL.</w:t>
+      </w:r>
+    </w:p>
+    <w:p>
+      <w:r>
+        <w:t>---</w:t>
+      </w:r>
+    </w:p>
+    <w:p>
+      <w:pPr>
+        <w:pStyle w:val="Heading1"/>
+      </w:pPr>
+      <w:r>
+        <w:t>7. Room &amp; Laboratory Eligibility</w:t>
+      </w:r>
+    </w:p>
+    <w:p>
+      <w:r>
+        <w:t>Room eligibility considers three factors:</w:t>
+      </w:r>
+    </w:p>
+    <w:p>
+      <w:pPr>
+        <w:pStyle w:val="ListNumber"/>
+      </w:pPr>
+      <w:r>
+        <w:t>**Room type** — must match the session requirement</w:t>
+      </w:r>
+    </w:p>
+    <w:p>
+      <w:pPr>
+        <w:pStyle w:val="ListNumber"/>
+      </w:pPr>
+      <w:r>
+        <w:t>**Room capacity** — section student count must not exceed capacity</w:t>
+      </w:r>
+    </w:p>
+    <w:p>
+      <w:pPr>
+        <w:pStyle w:val="ListNumber"/>
+      </w:pPr>
+      <w:r>
+        <w:t>**Room status/availability** — the room must be available</w:t>
+      </w:r>
+    </w:p>
+    <w:p>
+      <w:r>
+        <w:t>Current room types: `lecture`, `computer_lab`, `science_lab`, `electronics_lab`.</w:t>
+      </w:r>
+    </w:p>
+    <w:p>
+      <w:r>
+        <w:t>A subject's lab requirement (`lab_room_type`) determines the required laboratory room type — e.g., a subject requiring `computer_lab` labs can only have its lab sessions placed in `computer_lab` rooms; lecture sessions require lecture rooms.</w:t>
+      </w:r>
+    </w:p>
+    <w:p>
+      <w:r>
+        <w:t>---</w:t>
+      </w:r>
+    </w:p>
+    <w:p>
+      <w:pPr>
+        <w:pStyle w:val="Heading1"/>
+      </w:pPr>
+      <w:r>
+        <w:t>8. Three Protection Layers</w:t>
+      </w:r>
+    </w:p>
+    <w:p>
+      <w:r>
+        <w:t>Conflicts are prevented at three independent points:</w:t>
+      </w:r>
+    </w:p>
+    <w:p>
+      <w:r>
+        <w:t>Layer 1 — AI/CP-SAT generation. The scheduler applies the modeled scheduling constraints while generating the candidate schedule.</w:t>
+      </w:r>
+    </w:p>
+    <w:p>
+      <w:r>
+        <w:t>Layer 2 — Manual edit validation. When the Admin manually changes a session, backend validation checks the relevant scheduling rules and detects conflicts.</w:t>
+      </w:r>
+    </w:p>
+    <w:p>
+      <w:r>
+        <w:t>Layer 3 — Publish conflict gate. Before publication, the backend performs the final conflict validation and blocks publication when conflicts exist.</w:t>
+      </w:r>
+    </w:p>
+    <w:p>
+      <w:r>
+        <w:t>&gt; "AI proposes; the Admin decides." The AI is not the final authority.</w:t>
+      </w:r>
+    </w:p>
+    <w:p>
+      <w:r>
+        <w:t>---</w:t>
+      </w:r>
+    </w:p>
+    <w:p>
+      <w:pPr>
+        <w:pStyle w:val="Heading1"/>
+      </w:pPr>
+      <w:r>
+        <w:t>9. Features Reference</w:t>
       </w:r>
     </w:p>
     <w:tbl>
@@ -917,7 +1459,7 @@
               <w:rPr>
                 <w:sz w:val="20"/>
               </w:rPr>
-              <w:t>Sanctum token; **non-admin roles rejected**</w:t>
+              <w:t>Sanctum token; **non-admin roles rejected at login**</w:t>
             </w:r>
           </w:p>
         </w:tc>
@@ -999,7 +1541,89 @@
               <w:rPr>
                 <w:sz w:val="20"/>
               </w:rPr>
-              <w:t>Records with **name, type, max load**; qualifications; availability (days/times) — no login accounts</w:t>
+              <w:t>Records with **name, employment type, max load** — no login accounts</w:t>
+            </w:r>
+          </w:p>
+        </w:tc>
+      </w:tr>
+      <w:tr>
+        <w:tc>
+          <w:tcPr>
+            <w:tcW w:type="dxa" w:w="2880"/>
+          </w:tcPr>
+          <w:p>
+            <w:r>
+              <w:rPr>
+                <w:sz w:val="20"/>
+              </w:rPr>
+              <w:t>Faculty Availability</w:t>
+            </w:r>
+          </w:p>
+        </w:tc>
+        <w:tc>
+          <w:tcPr>
+            <w:tcW w:type="dxa" w:w="2880"/>
+          </w:tcPr>
+          <w:p>
+            <w:r>
+              <w:rPr>
+                <w:sz w:val="20"/>
+              </w:rPr>
+              <w:t>Faculty → Edit</w:t>
+            </w:r>
+          </w:p>
+        </w:tc>
+        <w:tc>
+          <w:tcPr>
+            <w:tcW w:type="dxa" w:w="2880"/>
+          </w:tcPr>
+          <w:p>
+            <w:r>
+              <w:rPr>
+                <w:sz w:val="20"/>
+              </w:rPr>
+              <w:t>Available days/times used by the scheduler</w:t>
+            </w:r>
+          </w:p>
+        </w:tc>
+      </w:tr>
+      <w:tr>
+        <w:tc>
+          <w:tcPr>
+            <w:tcW w:type="dxa" w:w="2880"/>
+          </w:tcPr>
+          <w:p>
+            <w:r>
+              <w:rPr>
+                <w:sz w:val="20"/>
+              </w:rPr>
+              <w:t>Faculty Qualifications</w:t>
+            </w:r>
+          </w:p>
+        </w:tc>
+        <w:tc>
+          <w:tcPr>
+            <w:tcW w:type="dxa" w:w="2880"/>
+          </w:tcPr>
+          <w:p>
+            <w:r>
+              <w:rPr>
+                <w:sz w:val="20"/>
+              </w:rPr>
+              <w:t>Faculty → Edit</w:t>
+            </w:r>
+          </w:p>
+        </w:tc>
+        <w:tc>
+          <w:tcPr>
+            <w:tcW w:type="dxa" w:w="2880"/>
+          </w:tcPr>
+          <w:p>
+            <w:r>
+              <w:rPr>
+                <w:sz w:val="20"/>
+              </w:rPr>
+              <w:t>Faculty-subject qualification mapping</w:t>
             </w:r>
           </w:p>
         </w:tc>
@@ -1040,7 +1664,7 @@
               <w:rPr>
                 <w:sz w:val="20"/>
               </w:rPr>
-              <w:t>Code, year level, semester, lecture/lab hours, lab room type</w:t>
+              <w:t>Code, year level, semester, lecture/lab hours, lab room type (validated: lab hours require a lab room type and vice versa)</w:t>
             </w:r>
           </w:p>
         </w:tc>
@@ -1081,7 +1705,7 @@
               <w:rPr>
                 <w:sz w:val="20"/>
               </w:rPr>
-              <w:t>Type (lecture/computer_lab), capacity, status</w:t>
+              <w:t>Type (lecture / computer_lab / science_lab / electronics_lab), capacity, status</w:t>
             </w:r>
           </w:p>
         </w:tc>
@@ -1137,7 +1761,7 @@
               <w:rPr>
                 <w:sz w:val="20"/>
               </w:rPr>
-              <w:t>AI Generation</w:t>
+              <w:t>AI Schedule Generation</w:t>
             </w:r>
           </w:p>
         </w:tc>
@@ -1163,7 +1787,7 @@
               <w:rPr>
                 <w:sz w:val="20"/>
               </w:rPr>
-              <w:t>One-click per section; OPTIMAL/PARTIAL/INFEASIBLE</w:t>
+              <w:t>One click per section; OPTIMAL / FEASIBLE / PARTIAL / INFEASIBLE</w:t>
             </w:r>
           </w:p>
         </w:tc>
@@ -1178,7 +1802,7 @@
               <w:rPr>
                 <w:sz w:val="20"/>
               </w:rPr>
-              <w:t>Approval workflow</w:t>
+              <w:t>Draft / Review / Edit</w:t>
             </w:r>
           </w:p>
         </w:tc>
@@ -1204,7 +1828,130 @@
               <w:rPr>
                 <w:sz w:val="20"/>
               </w:rPr>
-              <w:t>Draft → Approved → Published → Archived (+ Unpublish)</w:t>
+              <w:t>Manual session editing with conflict detection</w:t>
+            </w:r>
+          </w:p>
+        </w:tc>
+      </w:tr>
+      <w:tr>
+        <w:tc>
+          <w:tcPr>
+            <w:tcW w:type="dxa" w:w="2880"/>
+          </w:tcPr>
+          <w:p>
+            <w:r>
+              <w:rPr>
+                <w:sz w:val="20"/>
+              </w:rPr>
+              <w:t>Approval</w:t>
+            </w:r>
+          </w:p>
+        </w:tc>
+        <w:tc>
+          <w:tcPr>
+            <w:tcW w:type="dxa" w:w="2880"/>
+          </w:tcPr>
+          <w:p>
+            <w:r>
+              <w:rPr>
+                <w:sz w:val="20"/>
+              </w:rPr>
+              <w:t>Dashboard</w:t>
+            </w:r>
+          </w:p>
+        </w:tc>
+        <w:tc>
+          <w:tcPr>
+            <w:tcW w:type="dxa" w:w="2880"/>
+          </w:tcPr>
+          <w:p>
+            <w:r>
+              <w:rPr>
+                <w:sz w:val="20"/>
+              </w:rPr>
+              <w:t>Draft → Approved</w:t>
+            </w:r>
+          </w:p>
+        </w:tc>
+      </w:tr>
+      <w:tr>
+        <w:tc>
+          <w:tcPr>
+            <w:tcW w:type="dxa" w:w="2880"/>
+          </w:tcPr>
+          <w:p>
+            <w:r>
+              <w:rPr>
+                <w:sz w:val="20"/>
+              </w:rPr>
+              <w:t>Publish Conflict Gate</w:t>
+            </w:r>
+          </w:p>
+        </w:tc>
+        <w:tc>
+          <w:tcPr>
+            <w:tcW w:type="dxa" w:w="2880"/>
+          </w:tcPr>
+          <w:p>
+            <w:r>
+              <w:rPr>
+                <w:sz w:val="20"/>
+              </w:rPr>
+              <w:t>Dashboard</w:t>
+            </w:r>
+          </w:p>
+        </w:tc>
+        <w:tc>
+          <w:tcPr>
+            <w:tcW w:type="dxa" w:w="2880"/>
+          </w:tcPr>
+          <w:p>
+            <w:r>
+              <w:rPr>
+                <w:sz w:val="20"/>
+              </w:rPr>
+              <w:t>Final cross-section validation before publication</w:t>
+            </w:r>
+          </w:p>
+        </w:tc>
+      </w:tr>
+      <w:tr>
+        <w:tc>
+          <w:tcPr>
+            <w:tcW w:type="dxa" w:w="2880"/>
+          </w:tcPr>
+          <w:p>
+            <w:r>
+              <w:rPr>
+                <w:sz w:val="20"/>
+              </w:rPr>
+              <w:t>Unpublish</w:t>
+            </w:r>
+          </w:p>
+        </w:tc>
+        <w:tc>
+          <w:tcPr>
+            <w:tcW w:type="dxa" w:w="2880"/>
+          </w:tcPr>
+          <w:p>
+            <w:r>
+              <w:rPr>
+                <w:sz w:val="20"/>
+              </w:rPr>
+              <w:t>Dashboard</w:t>
+            </w:r>
+          </w:p>
+        </w:tc>
+        <w:tc>
+          <w:tcPr>
+            <w:tcW w:type="dxa" w:w="2880"/>
+          </w:tcPr>
+          <w:p>
+            <w:r>
+              <w:rPr>
+                <w:sz w:val="20"/>
+              </w:rPr>
+              <w:t>Published → Draft for corrections</w:t>
             </w:r>
           </w:p>
         </w:tc>
@@ -1245,48 +1992,7 @@
               <w:rPr>
                 <w:sz w:val="20"/>
               </w:rPr>
-              <w:t>Print-friendly weekly grid → PDF hard copy</w:t>
-            </w:r>
-          </w:p>
-        </w:tc>
-      </w:tr>
-      <w:tr>
-        <w:tc>
-          <w:tcPr>
-            <w:tcW w:type="dxa" w:w="2880"/>
-          </w:tcPr>
-          <w:p>
-            <w:r>
-              <w:rPr>
-                <w:sz w:val="20"/>
-              </w:rPr>
-              <w:t>Session editing</w:t>
-            </w:r>
-          </w:p>
-        </w:tc>
-        <w:tc>
-          <w:tcPr>
-            <w:tcW w:type="dxa" w:w="2880"/>
-          </w:tcPr>
-          <w:p>
-            <w:r>
-              <w:rPr>
-                <w:sz w:val="20"/>
-              </w:rPr>
-              <w:t>Dashboard</w:t>
-            </w:r>
-          </w:p>
-        </w:tc>
-        <w:tc>
-          <w:tcPr>
-            <w:tcW w:type="dxa" w:w="2880"/>
-          </w:tcPr>
-          <w:p>
-            <w:r>
-              <w:rPr>
-                <w:sz w:val="20"/>
-              </w:rPr>
-              <w:t>Real-time conflict detection</w:t>
+              <w:t>Print-friendly weekly grid → PDF / hard copy</w:t>
             </w:r>
           </w:p>
         </w:tc>
@@ -1327,7 +2033,48 @@
               <w:rPr>
                 <w:sz w:val="20"/>
               </w:rPr>
-              <w:t>Overview, Faculty Load, Room Usage, Sections, Generation Logs</w:t>
+              <w:t>Faculty Load, Room Usage, Sections, Status, Conflicts</w:t>
+            </w:r>
+          </w:p>
+        </w:tc>
+      </w:tr>
+      <w:tr>
+        <w:tc>
+          <w:tcPr>
+            <w:tcW w:type="dxa" w:w="2880"/>
+          </w:tcPr>
+          <w:p>
+            <w:r>
+              <w:rPr>
+                <w:sz w:val="20"/>
+              </w:rPr>
+              <w:t>Conflict Detection</w:t>
+            </w:r>
+          </w:p>
+        </w:tc>
+        <w:tc>
+          <w:tcPr>
+            <w:tcW w:type="dxa" w:w="2880"/>
+          </w:tcPr>
+          <w:p>
+            <w:r>
+              <w:rPr>
+                <w:sz w:val="20"/>
+              </w:rPr>
+              <w:t>Session editing + publish gate</w:t>
+            </w:r>
+          </w:p>
+        </w:tc>
+        <w:tc>
+          <w:tcPr>
+            <w:tcW w:type="dxa" w:w="2880"/>
+          </w:tcPr>
+          <w:p>
+            <w:r>
+              <w:rPr>
+                <w:sz w:val="20"/>
+              </w:rPr>
+              <w:t>Multiple protection layers</w:t>
             </w:r>
           </w:p>
         </w:tc>
@@ -1343,12 +2090,206 @@
         <w:pStyle w:val="Heading1"/>
       </w:pPr>
       <w:r>
-        <w:t>7. Database (11 tables)</w:t>
+        <w:t>10. Reports (current endpoints)</w:t>
+      </w:r>
+    </w:p>
+    <w:tbl>
+      <w:tblPr>
+        <w:tblStyle w:val="LightGrid-Accent1"/>
+        <w:tblW w:type="auto" w:w="0"/>
+        <w:tblLook w:firstColumn="1" w:firstRow="1" w:lastColumn="0" w:lastRow="0" w:noHBand="0" w:noVBand="1" w:val="04A0"/>
+      </w:tblPr>
+      <w:tblGrid>
+        <w:gridCol w:w="4320"/>
+        <w:gridCol w:w="4320"/>
+      </w:tblGrid>
+      <w:tr>
+        <w:tc>
+          <w:tcPr>
+            <w:tcW w:type="dxa" w:w="4320"/>
+          </w:tcPr>
+          <w:p>
+            <w:r>
+              <w:rPr>
+                <w:b/>
+                <w:sz w:val="20"/>
+              </w:rPr>
+              <w:t>Endpoint</w:t>
+            </w:r>
+          </w:p>
+        </w:tc>
+        <w:tc>
+          <w:tcPr>
+            <w:tcW w:type="dxa" w:w="4320"/>
+          </w:tcPr>
+          <w:p>
+            <w:r>
+              <w:rPr>
+                <w:b/>
+                <w:sz w:val="20"/>
+              </w:rPr>
+              <w:t>Purpose</w:t>
+            </w:r>
+          </w:p>
+        </w:tc>
+      </w:tr>
+      <w:tr>
+        <w:tc>
+          <w:tcPr>
+            <w:tcW w:type="dxa" w:w="4320"/>
+          </w:tcPr>
+          <w:p>
+            <w:r>
+              <w:rPr>
+                <w:sz w:val="20"/>
+              </w:rPr>
+              <w:t>`/api/reports/faculty-workload`</w:t>
+            </w:r>
+          </w:p>
+        </w:tc>
+        <w:tc>
+          <w:tcPr>
+            <w:tcW w:type="dxa" w:w="4320"/>
+          </w:tcPr>
+          <w:p>
+            <w:r>
+              <w:rPr>
+                <w:sz w:val="20"/>
+              </w:rPr>
+              <w:t>Assigned hours vs max load per faculty member</w:t>
+            </w:r>
+          </w:p>
+        </w:tc>
+      </w:tr>
+      <w:tr>
+        <w:tc>
+          <w:tcPr>
+            <w:tcW w:type="dxa" w:w="4320"/>
+          </w:tcPr>
+          <w:p>
+            <w:r>
+              <w:rPr>
+                <w:sz w:val="20"/>
+              </w:rPr>
+              <w:t>`/api/reports/room-utilization`</w:t>
+            </w:r>
+          </w:p>
+        </w:tc>
+        <w:tc>
+          <w:tcPr>
+            <w:tcW w:type="dxa" w:w="4320"/>
+          </w:tcPr>
+          <w:p>
+            <w:r>
+              <w:rPr>
+                <w:sz w:val="20"/>
+              </w:rPr>
+              <w:t>Booked hours per week per room</w:t>
+            </w:r>
+          </w:p>
+        </w:tc>
+      </w:tr>
+      <w:tr>
+        <w:tc>
+          <w:tcPr>
+            <w:tcW w:type="dxa" w:w="4320"/>
+          </w:tcPr>
+          <w:p>
+            <w:r>
+              <w:rPr>
+                <w:sz w:val="20"/>
+              </w:rPr>
+              <w:t>`/api/reports/conflicts`</w:t>
+            </w:r>
+          </w:p>
+        </w:tc>
+        <w:tc>
+          <w:tcPr>
+            <w:tcW w:type="dxa" w:w="4320"/>
+          </w:tcPr>
+          <w:p>
+            <w:r>
+              <w:rPr>
+                <w:sz w:val="20"/>
+              </w:rPr>
+              <w:t>Cross-section conflict scan of published schedules</w:t>
+            </w:r>
+          </w:p>
+        </w:tc>
+      </w:tr>
+      <w:tr>
+        <w:tc>
+          <w:tcPr>
+            <w:tcW w:type="dxa" w:w="4320"/>
+          </w:tcPr>
+          <w:p>
+            <w:r>
+              <w:rPr>
+                <w:sz w:val="20"/>
+              </w:rPr>
+              <w:t>`/api/reports/schedule-status`</w:t>
+            </w:r>
+          </w:p>
+        </w:tc>
+        <w:tc>
+          <w:tcPr>
+            <w:tcW w:type="dxa" w:w="4320"/>
+          </w:tcPr>
+          <w:p>
+            <w:r>
+              <w:rPr>
+                <w:sz w:val="20"/>
+              </w:rPr>
+              <w:t>Schedule status overview (draft/approved/published/archived counts)</w:t>
+            </w:r>
+          </w:p>
+        </w:tc>
+      </w:tr>
+      <w:tr>
+        <w:tc>
+          <w:tcPr>
+            <w:tcW w:type="dxa" w:w="4320"/>
+          </w:tcPr>
+          <w:p>
+            <w:r>
+              <w:rPr>
+                <w:sz w:val="20"/>
+              </w:rPr>
+              <w:t>`/api/reports/section-summary`</w:t>
+            </w:r>
+          </w:p>
+        </w:tc>
+        <w:tc>
+          <w:tcPr>
+            <w:tcW w:type="dxa" w:w="4320"/>
+          </w:tcPr>
+          <w:p>
+            <w:r>
+              <w:rPr>
+                <w:sz w:val="20"/>
+              </w:rPr>
+              <w:t>Sessions, hours, faculty count per section</w:t>
+            </w:r>
+          </w:p>
+        </w:tc>
+      </w:tr>
+    </w:tbl>
+    <w:p>
+      <w:r>
+        <w:t>---</w:t>
+      </w:r>
+    </w:p>
+    <w:p>
+      <w:pPr>
+        <w:pStyle w:val="Heading1"/>
+      </w:pPr>
+      <w:r>
+        <w:t>11. Database (11 tables)</w:t>
       </w:r>
     </w:p>
     <w:p>
       <w:r>
-        <w:t>`users` (admin only) · `faculties` (name stored directly, no login) · `faculty_availabilities` · `subjects` · `faculty_subjects` · `sections` · `section_subjects` · `rooms` · `schedules` · `schedule_sessions` · `schedule_generation_logs`</w:t>
+        <w:t>`users` (admin login accounts only) · `faculties` (scheduling records — name stored directly; `user_id` exists only as an optional/nullable legacy relationship, not a login mechanism) · `faculty_availabilities` · `subjects` · `faculty_subjects` · `sections` · `section_subjects` · `rooms` · `schedules` · `schedule_sessions` · `schedule_generation_logs`</w:t>
       </w:r>
     </w:p>
     <w:p>
@@ -1361,7 +2302,7 @@
         <w:pStyle w:val="Heading1"/>
       </w:pPr>
       <w:r>
-        <w:t>8. Users &amp; Roles</w:t>
+        <w:t>12. Users &amp; Roles</w:t>
       </w:r>
     </w:p>
     <w:tbl>
@@ -1427,7 +2368,7 @@
               <w:rPr>
                 <w:sz w:val="20"/>
               </w:rPr>
-              <w:t>The only login. Full access: manage data, generate, review/edit, approve, publish, unpublish, print, reports</w:t>
+              <w:t>The only login. Full access: manage data, generate, review/edit, approve, publish, unpublish, print/download, reports</w:t>
             </w:r>
           </w:p>
         </w:tc>
@@ -1455,7 +2396,35 @@
               <w:rPr>
                 <w:sz w:val="20"/>
               </w:rPr>
-              <w:t>No system access — records used by the scheduler; receive printed schedules</w:t>
+              <w:t>No system access — scheduling records used by the engine; receive schedules via printed/PDF distribution</w:t>
+            </w:r>
+          </w:p>
+        </w:tc>
+      </w:tr>
+      <w:tr>
+        <w:tc>
+          <w:tcPr>
+            <w:tcW w:type="dxa" w:w="4320"/>
+          </w:tcPr>
+          <w:p>
+            <w:r>
+              <w:rPr>
+                <w:sz w:val="20"/>
+              </w:rPr>
+              <w:t>**Students**</w:t>
+            </w:r>
+          </w:p>
+        </w:tc>
+        <w:tc>
+          <w:tcPr>
+            <w:tcW w:type="dxa" w:w="4320"/>
+          </w:tcPr>
+          <w:p>
+            <w:r>
+              <w:rPr>
+                <w:sz w:val="20"/>
+              </w:rPr>
+              <w:t>No system access — see posted/published schedules</w:t>
             </w:r>
           </w:p>
         </w:tc>
@@ -1471,7 +2440,7 @@
         <w:pStyle w:val="Heading1"/>
       </w:pPr>
       <w:r>
-        <w:t>9. Verification &amp; Tests</w:t>
+        <w:t>13. Verification &amp; Tests</w:t>
       </w:r>
     </w:p>
     <w:p>
@@ -1479,7 +2448,7 @@
         <w:pStyle w:val="ListBullet"/>
       </w:pPr>
       <w:r>
-        <w:t>Backend feature tests (`php artisan test`) run against a dedicated `scheduling_system_testing` database — real data is never touched</w:t>
+        <w:t>Backend feature tests (`php artisan test`, 6/6 passing) run against a dedicated `scheduling_system_testing` database — real data is never touched</w:t>
       </w:r>
     </w:p>
     <w:p>
@@ -1495,7 +2464,15 @@
         <w:pStyle w:val="ListBullet"/>
       </w:pPr>
       <w:r>
-        <w:t>TypeScript typecheck clean; admin login, faculty records, reports, and conflict detection verified end-to-end</w:t>
+        <w:t>Frontend TypeScript typecheck clean; production build passes</w:t>
+      </w:r>
+    </w:p>
+    <w:p>
+      <w:pPr>
+        <w:pStyle w:val="ListBullet"/>
+      </w:pPr>
+      <w:r>
+        <w:t>Live end-to-end integration test performed (September 2026): admin login → AI generation for BIT-3A (OPTIMAL, 3 sessions, all 8 constraint categories verified) → approve → publish (conflict gate) → unpublish → reports — all passed</w:t>
       </w:r>
     </w:p>
     <w:p>
@@ -1508,63 +2485,37 @@
         <w:pStyle w:val="Heading1"/>
       </w:pPr>
       <w:r>
-        <w:t>10. Defense Talking Points</w:t>
+        <w:t>14. Defense Talking Points</w:t>
       </w:r>
     </w:p>
     <w:p>
-      <w:pPr>
-        <w:pStyle w:val="ListNumber"/>
-      </w:pPr>
       <w:r>
-        <w:t>**Constraint-based approach** — CP-SAT gives a mathematical guarantee, not trial-and-error</w:t>
+        <w:t>Why constraint-based scheduling? Scheduling is a constraint satisfaction/optimization problem involving faculty, rooms, sections, time windows, qualifications, capacity, and conflicts. CP-SAT models it mathematically rather than by trial and error.</w:t>
       </w:r>
     </w:p>
     <w:p>
-      <w:pPr>
-        <w:pStyle w:val="ListNumber"/>
-      </w:pPr>
       <w:r>
-        <w:t>**8 hard constraints** covering real scheduling rules</w:t>
+        <w:t>Why OR-Tools CP-SAT? CP-SAT provides a mathematical constraint-solving approach for finding feasible and optimized schedules.</w:t>
       </w:r>
     </w:p>
     <w:p>
-      <w:pPr>
-        <w:pStyle w:val="ListNumber"/>
-      </w:pPr>
       <w:r>
-        <w:t>**Best-effort philosophy** — PARTIAL results place what can be placed</w:t>
+        <w:t>What does OPTIMAL mean? When CP-SAT returns OPTIMAL, the solver has proven optimality for the modeled objective under the given constraints and search conditions.</w:t>
       </w:r>
     </w:p>
     <w:p>
-      <w:pPr>
-        <w:pStyle w:val="ListNumber"/>
-      </w:pPr>
       <w:r>
-        <w:t>**Admin-only security model** — deliberate design decision: per-semester use, printed distribution, reduced attack surface</w:t>
+        <w:t>Is AI the final decision-maker? No. The AI generates a candidate schedule. The Admin reviews, edits if necessary, approves, and explicitly publishes it.</w:t>
       </w:r>
     </w:p>
     <w:p>
-      <w:pPr>
-        <w:pStyle w:val="ListNumber"/>
-      </w:pPr>
       <w:r>
-        <w:t>**Real-time conflict detection** on manual edits</w:t>
+        <w:t>Why no faculty login? The department operates the system per semester. Faculty scheduling information is maintained as records by the Admin, and finalized schedules are distributed as printed/PDF copies. Faculty accounts are therefore unnecessary for the current scope.</w:t>
       </w:r>
     </w:p>
     <w:p>
-      <w:pPr>
-        <w:pStyle w:val="ListNumber"/>
-      </w:pPr>
       <w:r>
-        <w:t>**Publish conflict gate** prevents cross-section double-booking</w:t>
-      </w:r>
-    </w:p>
-    <w:p>
-      <w:pPr>
-        <w:pStyle w:val="ListNumber"/>
-      </w:pPr>
-      <w:r>
-        <w:t>**Unpublish** allows corrections without losing work</w:t>
+        <w:t>How are conflicts prevented? Through three layers: (1) solver constraints, (2) manual-edit validation, (3) the publish conflict gate.</w:t>
       </w:r>
     </w:p>
     <w:p>

</xml_diff>